<commit_message>
Sol panel düzenlendi. Sağ panel şablon seçimi ve kullanıcı panelinden gelirken şablon seçimi düzenlendi.
</commit_message>
<xml_diff>
--- a/docs/ui/Presserdiado_Component_Spec_v3.1_1.docx
+++ b/docs/ui/Presserdiado_Component_Spec_v3.1_1.docx
@@ -348,12 +348,6 @@
         <w:gridCol w:w="3220"/>
       </w:tblGrid>
       <w:tr>
-        <w:tblPrEx>
-          <w:tblCellMar>
-            <w:top w:w="0" w:type="dxa"/>
-            <w:bottom w:w="0" w:type="dxa"/>
-          </w:tblCellMar>
-        </w:tblPrEx>
         <w:trPr>
           <w:tblHeader/>
         </w:trPr>
@@ -501,12 +495,6 @@
         </w:tc>
       </w:tr>
       <w:tr>
-        <w:tblPrEx>
-          <w:tblCellMar>
-            <w:top w:w="0" w:type="dxa"/>
-            <w:bottom w:w="0" w:type="dxa"/>
-          </w:tblCellMar>
-        </w:tblPrEx>
         <w:tc>
           <w:tcPr>
             <w:tcW w:w="2000" w:type="dxa"/>
@@ -671,12 +659,6 @@
         </w:tc>
       </w:tr>
       <w:tr>
-        <w:tblPrEx>
-          <w:tblCellMar>
-            <w:top w:w="0" w:type="dxa"/>
-            <w:bottom w:w="0" w:type="dxa"/>
-          </w:tblCellMar>
-        </w:tblPrEx>
         <w:tc>
           <w:tcPr>
             <w:tcW w:w="2000" w:type="dxa"/>
@@ -835,12 +817,6 @@
         </w:tc>
       </w:tr>
       <w:tr>
-        <w:tblPrEx>
-          <w:tblCellMar>
-            <w:top w:w="0" w:type="dxa"/>
-            <w:bottom w:w="0" w:type="dxa"/>
-          </w:tblCellMar>
-        </w:tblPrEx>
         <w:tc>
           <w:tcPr>
             <w:tcW w:w="2000" w:type="dxa"/>
@@ -1005,12 +981,6 @@
         </w:tc>
       </w:tr>
       <w:tr>
-        <w:tblPrEx>
-          <w:tblCellMar>
-            <w:top w:w="0" w:type="dxa"/>
-            <w:bottom w:w="0" w:type="dxa"/>
-          </w:tblCellMar>
-        </w:tblPrEx>
         <w:tc>
           <w:tcPr>
             <w:tcW w:w="2000" w:type="dxa"/>
@@ -1155,12 +1125,6 @@
         </w:tc>
       </w:tr>
       <w:tr>
-        <w:tblPrEx>
-          <w:tblCellMar>
-            <w:top w:w="0" w:type="dxa"/>
-            <w:bottom w:w="0" w:type="dxa"/>
-          </w:tblCellMar>
-        </w:tblPrEx>
         <w:tc>
           <w:tcPr>
             <w:tcW w:w="2000" w:type="dxa"/>
@@ -1305,12 +1269,6 @@
         </w:tc>
       </w:tr>
       <w:tr>
-        <w:tblPrEx>
-          <w:tblCellMar>
-            <w:top w:w="0" w:type="dxa"/>
-            <w:bottom w:w="0" w:type="dxa"/>
-          </w:tblCellMar>
-        </w:tblPrEx>
         <w:tc>
           <w:tcPr>
             <w:tcW w:w="2000" w:type="dxa"/>
@@ -1466,12 +1424,6 @@
         </w:tc>
       </w:tr>
       <w:tr>
-        <w:tblPrEx>
-          <w:tblCellMar>
-            <w:top w:w="0" w:type="dxa"/>
-            <w:bottom w:w="0" w:type="dxa"/>
-          </w:tblCellMar>
-        </w:tblPrEx>
         <w:tc>
           <w:tcPr>
             <w:tcW w:w="2000" w:type="dxa"/>
@@ -1627,12 +1579,6 @@
         </w:tc>
       </w:tr>
       <w:tr>
-        <w:tblPrEx>
-          <w:tblCellMar>
-            <w:top w:w="0" w:type="dxa"/>
-            <w:bottom w:w="0" w:type="dxa"/>
-          </w:tblCellMar>
-        </w:tblPrEx>
         <w:tc>
           <w:tcPr>
             <w:tcW w:w="2000" w:type="dxa"/>
@@ -1797,12 +1743,6 @@
         </w:tc>
       </w:tr>
       <w:tr>
-        <w:tblPrEx>
-          <w:tblCellMar>
-            <w:top w:w="0" w:type="dxa"/>
-            <w:bottom w:w="0" w:type="dxa"/>
-          </w:tblCellMar>
-        </w:tblPrEx>
         <w:tc>
           <w:tcPr>
             <w:tcW w:w="2000" w:type="dxa"/>
@@ -1955,12 +1895,6 @@
         </w:tc>
       </w:tr>
       <w:tr>
-        <w:tblPrEx>
-          <w:tblCellMar>
-            <w:top w:w="0" w:type="dxa"/>
-            <w:bottom w:w="0" w:type="dxa"/>
-          </w:tblCellMar>
-        </w:tblPrEx>
         <w:tc>
           <w:tcPr>
             <w:tcW w:w="2000" w:type="dxa"/>
@@ -2473,12 +2407,6 @@
         <w:gridCol w:w="4126"/>
       </w:tblGrid>
       <w:tr>
-        <w:tblPrEx>
-          <w:tblCellMar>
-            <w:top w:w="0" w:type="dxa"/>
-            <w:bottom w:w="0" w:type="dxa"/>
-          </w:tblCellMar>
-        </w:tblPrEx>
         <w:trPr>
           <w:tblHeader/>
         </w:trPr>
@@ -2541,12 +2469,6 @@
         </w:tc>
       </w:tr>
       <w:tr>
-        <w:tblPrEx>
-          <w:tblCellMar>
-            <w:top w:w="0" w:type="dxa"/>
-            <w:bottom w:w="0" w:type="dxa"/>
-          </w:tblCellMar>
-        </w:tblPrEx>
         <w:tc>
           <w:tcPr>
             <w:tcW w:w="3500" w:type="dxa"/>
@@ -2687,12 +2609,6 @@
         </w:tc>
       </w:tr>
       <w:tr>
-        <w:tblPrEx>
-          <w:tblCellMar>
-            <w:top w:w="0" w:type="dxa"/>
-            <w:bottom w:w="0" w:type="dxa"/>
-          </w:tblCellMar>
-        </w:tblPrEx>
         <w:tc>
           <w:tcPr>
             <w:tcW w:w="3500" w:type="dxa"/>
@@ -2806,12 +2722,6 @@
         </w:tc>
       </w:tr>
       <w:tr>
-        <w:tblPrEx>
-          <w:tblCellMar>
-            <w:top w:w="0" w:type="dxa"/>
-            <w:bottom w:w="0" w:type="dxa"/>
-          </w:tblCellMar>
-        </w:tblPrEx>
         <w:tc>
           <w:tcPr>
             <w:tcW w:w="3500" w:type="dxa"/>
@@ -2916,12 +2826,6 @@
         </w:tc>
       </w:tr>
       <w:tr>
-        <w:tblPrEx>
-          <w:tblCellMar>
-            <w:top w:w="0" w:type="dxa"/>
-            <w:bottom w:w="0" w:type="dxa"/>
-          </w:tblCellMar>
-        </w:tblPrEx>
         <w:tc>
           <w:tcPr>
             <w:tcW w:w="3500" w:type="dxa"/>
@@ -3013,12 +2917,6 @@
         </w:tc>
       </w:tr>
       <w:tr>
-        <w:tblPrEx>
-          <w:tblCellMar>
-            <w:top w:w="0" w:type="dxa"/>
-            <w:bottom w:w="0" w:type="dxa"/>
-          </w:tblCellMar>
-        </w:tblPrEx>
         <w:tc>
           <w:tcPr>
             <w:tcW w:w="3500" w:type="dxa"/>
@@ -3110,12 +3008,6 @@
         </w:tc>
       </w:tr>
       <w:tr>
-        <w:tblPrEx>
-          <w:tblCellMar>
-            <w:top w:w="0" w:type="dxa"/>
-            <w:bottom w:w="0" w:type="dxa"/>
-          </w:tblCellMar>
-        </w:tblPrEx>
         <w:tc>
           <w:tcPr>
             <w:tcW w:w="3500" w:type="dxa"/>
@@ -3926,12 +3818,6 @@
         <w:gridCol w:w="1426"/>
       </w:tblGrid>
       <w:tr>
-        <w:tblPrEx>
-          <w:tblCellMar>
-            <w:top w:w="0" w:type="dxa"/>
-            <w:bottom w:w="0" w:type="dxa"/>
-          </w:tblCellMar>
-        </w:tblPrEx>
         <w:trPr>
           <w:tblHeader/>
         </w:trPr>
@@ -4077,12 +3963,6 @@
         </w:tc>
       </w:tr>
       <w:tr>
-        <w:tblPrEx>
-          <w:tblCellMar>
-            <w:top w:w="0" w:type="dxa"/>
-            <w:bottom w:w="0" w:type="dxa"/>
-          </w:tblCellMar>
-        </w:tblPrEx>
         <w:tc>
           <w:tcPr>
             <w:tcW w:w="1400" w:type="dxa"/>
@@ -4214,12 +4094,6 @@
         </w:tc>
       </w:tr>
       <w:tr>
-        <w:tblPrEx>
-          <w:tblCellMar>
-            <w:top w:w="0" w:type="dxa"/>
-            <w:bottom w:w="0" w:type="dxa"/>
-          </w:tblCellMar>
-        </w:tblPrEx>
         <w:tc>
           <w:tcPr>
             <w:tcW w:w="1400" w:type="dxa"/>
@@ -4387,12 +4261,6 @@
         </w:tc>
       </w:tr>
       <w:tr>
-        <w:tblPrEx>
-          <w:tblCellMar>
-            <w:top w:w="0" w:type="dxa"/>
-            <w:bottom w:w="0" w:type="dxa"/>
-          </w:tblCellMar>
-        </w:tblPrEx>
         <w:tc>
           <w:tcPr>
             <w:tcW w:w="1400" w:type="dxa"/>
@@ -4538,12 +4406,6 @@
         </w:tc>
       </w:tr>
       <w:tr>
-        <w:tblPrEx>
-          <w:tblCellMar>
-            <w:top w:w="0" w:type="dxa"/>
-            <w:bottom w:w="0" w:type="dxa"/>
-          </w:tblCellMar>
-        </w:tblPrEx>
         <w:tc>
           <w:tcPr>
             <w:tcW w:w="1400" w:type="dxa"/>
@@ -4675,12 +4537,6 @@
         </w:tc>
       </w:tr>
       <w:tr>
-        <w:tblPrEx>
-          <w:tblCellMar>
-            <w:top w:w="0" w:type="dxa"/>
-            <w:bottom w:w="0" w:type="dxa"/>
-          </w:tblCellMar>
-        </w:tblPrEx>
         <w:tc>
           <w:tcPr>
             <w:tcW w:w="1400" w:type="dxa"/>
@@ -4851,12 +4707,6 @@
         <w:gridCol w:w="4126"/>
       </w:tblGrid>
       <w:tr>
-        <w:tblPrEx>
-          <w:tblCellMar>
-            <w:top w:w="0" w:type="dxa"/>
-            <w:bottom w:w="0" w:type="dxa"/>
-          </w:tblCellMar>
-        </w:tblPrEx>
         <w:trPr>
           <w:tblHeader/>
         </w:trPr>
@@ -4919,12 +4769,6 @@
         </w:tc>
       </w:tr>
       <w:tr>
-        <w:tblPrEx>
-          <w:tblCellMar>
-            <w:top w:w="0" w:type="dxa"/>
-            <w:bottom w:w="0" w:type="dxa"/>
-          </w:tblCellMar>
-        </w:tblPrEx>
         <w:tc>
           <w:tcPr>
             <w:tcW w:w="3500" w:type="dxa"/>
@@ -5019,12 +4863,6 @@
         </w:tc>
       </w:tr>
       <w:tr>
-        <w:tblPrEx>
-          <w:tblCellMar>
-            <w:top w:w="0" w:type="dxa"/>
-            <w:bottom w:w="0" w:type="dxa"/>
-          </w:tblCellMar>
-        </w:tblPrEx>
         <w:tc>
           <w:tcPr>
             <w:tcW w:w="3500" w:type="dxa"/>
@@ -5105,12 +4943,6 @@
         </w:tc>
       </w:tr>
       <w:tr>
-        <w:tblPrEx>
-          <w:tblCellMar>
-            <w:top w:w="0" w:type="dxa"/>
-            <w:bottom w:w="0" w:type="dxa"/>
-          </w:tblCellMar>
-        </w:tblPrEx>
         <w:tc>
           <w:tcPr>
             <w:tcW w:w="3500" w:type="dxa"/>
@@ -5179,12 +5011,6 @@
         </w:tc>
       </w:tr>
       <w:tr>
-        <w:tblPrEx>
-          <w:tblCellMar>
-            <w:top w:w="0" w:type="dxa"/>
-            <w:bottom w:w="0" w:type="dxa"/>
-          </w:tblCellMar>
-        </w:tblPrEx>
         <w:tc>
           <w:tcPr>
             <w:tcW w:w="3500" w:type="dxa"/>
@@ -5237,12 +5063,6 @@
         </w:tc>
       </w:tr>
       <w:tr>
-        <w:tblPrEx>
-          <w:tblCellMar>
-            <w:top w:w="0" w:type="dxa"/>
-            <w:bottom w:w="0" w:type="dxa"/>
-          </w:tblCellMar>
-        </w:tblPrEx>
         <w:tc>
           <w:tcPr>
             <w:tcW w:w="3500" w:type="dxa"/>
@@ -5325,12 +5145,6 @@
         </w:tc>
       </w:tr>
       <w:tr>
-        <w:tblPrEx>
-          <w:tblCellMar>
-            <w:top w:w="0" w:type="dxa"/>
-            <w:bottom w:w="0" w:type="dxa"/>
-          </w:tblCellMar>
-        </w:tblPrEx>
         <w:tc>
           <w:tcPr>
             <w:tcW w:w="3500" w:type="dxa"/>
@@ -5383,12 +5197,6 @@
         </w:tc>
       </w:tr>
       <w:tr>
-        <w:tblPrEx>
-          <w:tblCellMar>
-            <w:top w:w="0" w:type="dxa"/>
-            <w:bottom w:w="0" w:type="dxa"/>
-          </w:tblCellMar>
-        </w:tblPrEx>
         <w:tc>
           <w:tcPr>
             <w:tcW w:w="3500" w:type="dxa"/>
@@ -5511,12 +5319,6 @@
         <w:gridCol w:w="2863"/>
       </w:tblGrid>
       <w:tr>
-        <w:tblPrEx>
-          <w:tblCellMar>
-            <w:top w:w="0" w:type="dxa"/>
-            <w:bottom w:w="0" w:type="dxa"/>
-          </w:tblCellMar>
-        </w:tblPrEx>
         <w:trPr>
           <w:tblHeader/>
         </w:trPr>
@@ -5616,12 +5418,6 @@
         </w:tc>
       </w:tr>
       <w:tr>
-        <w:tblPrEx>
-          <w:tblCellMar>
-            <w:top w:w="0" w:type="dxa"/>
-            <w:bottom w:w="0" w:type="dxa"/>
-          </w:tblCellMar>
-        </w:tblPrEx>
         <w:tc>
           <w:tcPr>
             <w:tcW w:w="2000" w:type="dxa"/>
@@ -5703,12 +5499,6 @@
         </w:tc>
       </w:tr>
       <w:tr>
-        <w:tblPrEx>
-          <w:tblCellMar>
-            <w:top w:w="0" w:type="dxa"/>
-            <w:bottom w:w="0" w:type="dxa"/>
-          </w:tblCellMar>
-        </w:tblPrEx>
         <w:tc>
           <w:tcPr>
             <w:tcW w:w="2000" w:type="dxa"/>
@@ -5816,12 +5606,6 @@
         </w:tc>
       </w:tr>
       <w:tr>
-        <w:tblPrEx>
-          <w:tblCellMar>
-            <w:top w:w="0" w:type="dxa"/>
-            <w:bottom w:w="0" w:type="dxa"/>
-          </w:tblCellMar>
-        </w:tblPrEx>
         <w:tc>
           <w:tcPr>
             <w:tcW w:w="2000" w:type="dxa"/>
@@ -5923,12 +5707,6 @@
         </w:tc>
       </w:tr>
       <w:tr>
-        <w:tblPrEx>
-          <w:tblCellMar>
-            <w:top w:w="0" w:type="dxa"/>
-            <w:bottom w:w="0" w:type="dxa"/>
-          </w:tblCellMar>
-        </w:tblPrEx>
         <w:tc>
           <w:tcPr>
             <w:tcW w:w="2000" w:type="dxa"/>
@@ -6211,12 +5989,6 @@
         <w:gridCol w:w="1426"/>
       </w:tblGrid>
       <w:tr>
-        <w:tblPrEx>
-          <w:tblCellMar>
-            <w:top w:w="0" w:type="dxa"/>
-            <w:bottom w:w="0" w:type="dxa"/>
-          </w:tblCellMar>
-        </w:tblPrEx>
         <w:trPr>
           <w:tblHeader/>
         </w:trPr>
@@ -6334,12 +6106,6 @@
         </w:tc>
       </w:tr>
       <w:tr>
-        <w:tblPrEx>
-          <w:tblCellMar>
-            <w:top w:w="0" w:type="dxa"/>
-            <w:bottom w:w="0" w:type="dxa"/>
-          </w:tblCellMar>
-        </w:tblPrEx>
         <w:tc>
           <w:tcPr>
             <w:tcW w:w="1800" w:type="dxa"/>
@@ -6468,12 +6234,6 @@
         </w:tc>
       </w:tr>
       <w:tr>
-        <w:tblPrEx>
-          <w:tblCellMar>
-            <w:top w:w="0" w:type="dxa"/>
-            <w:bottom w:w="0" w:type="dxa"/>
-          </w:tblCellMar>
-        </w:tblPrEx>
         <w:tc>
           <w:tcPr>
             <w:tcW w:w="1800" w:type="dxa"/>
@@ -6576,12 +6336,6 @@
         </w:tc>
       </w:tr>
       <w:tr>
-        <w:tblPrEx>
-          <w:tblCellMar>
-            <w:top w:w="0" w:type="dxa"/>
-            <w:bottom w:w="0" w:type="dxa"/>
-          </w:tblCellMar>
-        </w:tblPrEx>
         <w:tc>
           <w:tcPr>
             <w:tcW w:w="1800" w:type="dxa"/>
@@ -6763,12 +6517,6 @@
         <w:gridCol w:w="4126"/>
       </w:tblGrid>
       <w:tr>
-        <w:tblPrEx>
-          <w:tblCellMar>
-            <w:top w:w="0" w:type="dxa"/>
-            <w:bottom w:w="0" w:type="dxa"/>
-          </w:tblCellMar>
-        </w:tblPrEx>
         <w:trPr>
           <w:tblHeader/>
         </w:trPr>
@@ -6830,12 +6578,6 @@
         </w:tc>
       </w:tr>
       <w:tr>
-        <w:tblPrEx>
-          <w:tblCellMar>
-            <w:top w:w="0" w:type="dxa"/>
-            <w:bottom w:w="0" w:type="dxa"/>
-          </w:tblCellMar>
-        </w:tblPrEx>
         <w:tc>
           <w:tcPr>
             <w:tcW w:w="3500" w:type="dxa"/>
@@ -6888,12 +6630,6 @@
         </w:tc>
       </w:tr>
       <w:tr>
-        <w:tblPrEx>
-          <w:tblCellMar>
-            <w:top w:w="0" w:type="dxa"/>
-            <w:bottom w:w="0" w:type="dxa"/>
-          </w:tblCellMar>
-        </w:tblPrEx>
         <w:tc>
           <w:tcPr>
             <w:tcW w:w="3500" w:type="dxa"/>
@@ -6947,12 +6683,6 @@
         </w:tc>
       </w:tr>
       <w:tr>
-        <w:tblPrEx>
-          <w:tblCellMar>
-            <w:top w:w="0" w:type="dxa"/>
-            <w:bottom w:w="0" w:type="dxa"/>
-          </w:tblCellMar>
-        </w:tblPrEx>
         <w:tc>
           <w:tcPr>
             <w:tcW w:w="3500" w:type="dxa"/>
@@ -7041,12 +6771,6 @@
         </w:tc>
       </w:tr>
       <w:tr>
-        <w:tblPrEx>
-          <w:tblCellMar>
-            <w:top w:w="0" w:type="dxa"/>
-            <w:bottom w:w="0" w:type="dxa"/>
-          </w:tblCellMar>
-        </w:tblPrEx>
         <w:tc>
           <w:tcPr>
             <w:tcW w:w="3500" w:type="dxa"/>
@@ -7143,12 +6867,6 @@
         </w:tc>
       </w:tr>
       <w:tr>
-        <w:tblPrEx>
-          <w:tblCellMar>
-            <w:top w:w="0" w:type="dxa"/>
-            <w:bottom w:w="0" w:type="dxa"/>
-          </w:tblCellMar>
-        </w:tblPrEx>
         <w:tc>
           <w:tcPr>
             <w:tcW w:w="3500" w:type="dxa"/>
@@ -7450,12 +7168,6 @@
         <w:gridCol w:w="2863"/>
       </w:tblGrid>
       <w:tr>
-        <w:tblPrEx>
-          <w:tblCellMar>
-            <w:top w:w="0" w:type="dxa"/>
-            <w:bottom w:w="0" w:type="dxa"/>
-          </w:tblCellMar>
-        </w:tblPrEx>
         <w:trPr>
           <w:tblHeader/>
         </w:trPr>
@@ -7557,12 +7269,6 @@
         </w:tc>
       </w:tr>
       <w:tr>
-        <w:tblPrEx>
-          <w:tblCellMar>
-            <w:top w:w="0" w:type="dxa"/>
-            <w:bottom w:w="0" w:type="dxa"/>
-          </w:tblCellMar>
-        </w:tblPrEx>
         <w:tc>
           <w:tcPr>
             <w:tcW w:w="2000" w:type="dxa"/>
@@ -7670,12 +7376,6 @@
         </w:tc>
       </w:tr>
       <w:tr>
-        <w:tblPrEx>
-          <w:tblCellMar>
-            <w:top w:w="0" w:type="dxa"/>
-            <w:bottom w:w="0" w:type="dxa"/>
-          </w:tblCellMar>
-        </w:tblPrEx>
         <w:tc>
           <w:tcPr>
             <w:tcW w:w="2000" w:type="dxa"/>
@@ -7816,12 +7516,6 @@
         <w:gridCol w:w="4126"/>
       </w:tblGrid>
       <w:tr>
-        <w:tblPrEx>
-          <w:tblCellMar>
-            <w:top w:w="0" w:type="dxa"/>
-            <w:bottom w:w="0" w:type="dxa"/>
-          </w:tblCellMar>
-        </w:tblPrEx>
         <w:trPr>
           <w:tblHeader/>
         </w:trPr>
@@ -7883,12 +7577,6 @@
         </w:tc>
       </w:tr>
       <w:tr>
-        <w:tblPrEx>
-          <w:tblCellMar>
-            <w:top w:w="0" w:type="dxa"/>
-            <w:bottom w:w="0" w:type="dxa"/>
-          </w:tblCellMar>
-        </w:tblPrEx>
         <w:tc>
           <w:tcPr>
             <w:tcW w:w="3500" w:type="dxa"/>
@@ -7949,12 +7637,6 @@
         </w:tc>
       </w:tr>
       <w:tr>
-        <w:tblPrEx>
-          <w:tblCellMar>
-            <w:top w:w="0" w:type="dxa"/>
-            <w:bottom w:w="0" w:type="dxa"/>
-          </w:tblCellMar>
-        </w:tblPrEx>
         <w:tc>
           <w:tcPr>
             <w:tcW w:w="3500" w:type="dxa"/>
@@ -8015,12 +7697,6 @@
         </w:tc>
       </w:tr>
       <w:tr>
-        <w:tblPrEx>
-          <w:tblCellMar>
-            <w:top w:w="0" w:type="dxa"/>
-            <w:bottom w:w="0" w:type="dxa"/>
-          </w:tblCellMar>
-        </w:tblPrEx>
         <w:tc>
           <w:tcPr>
             <w:tcW w:w="3500" w:type="dxa"/>
@@ -8073,12 +7749,6 @@
         </w:tc>
       </w:tr>
       <w:tr>
-        <w:tblPrEx>
-          <w:tblCellMar>
-            <w:top w:w="0" w:type="dxa"/>
-            <w:bottom w:w="0" w:type="dxa"/>
-          </w:tblCellMar>
-        </w:tblPrEx>
         <w:tc>
           <w:tcPr>
             <w:tcW w:w="3500" w:type="dxa"/>
@@ -8149,12 +7819,6 @@
         </w:tc>
       </w:tr>
       <w:tr>
-        <w:tblPrEx>
-          <w:tblCellMar>
-            <w:top w:w="0" w:type="dxa"/>
-            <w:bottom w:w="0" w:type="dxa"/>
-          </w:tblCellMar>
-        </w:tblPrEx>
         <w:tc>
           <w:tcPr>
             <w:tcW w:w="3500" w:type="dxa"/>
@@ -8458,12 +8122,6 @@
         <w:gridCol w:w="3226"/>
       </w:tblGrid>
       <w:tr>
-        <w:tblPrEx>
-          <w:tblCellMar>
-            <w:top w:w="0" w:type="dxa"/>
-            <w:bottom w:w="0" w:type="dxa"/>
-          </w:tblCellMar>
-        </w:tblPrEx>
         <w:trPr>
           <w:tblHeader/>
         </w:trPr>
@@ -8553,12 +8211,6 @@
         </w:tc>
       </w:tr>
       <w:tr>
-        <w:tblPrEx>
-          <w:tblCellMar>
-            <w:top w:w="0" w:type="dxa"/>
-            <w:bottom w:w="0" w:type="dxa"/>
-          </w:tblCellMar>
-        </w:tblPrEx>
         <w:tc>
           <w:tcPr>
             <w:tcW w:w="2200" w:type="dxa"/>
@@ -8660,12 +8312,6 @@
         </w:tc>
       </w:tr>
       <w:tr>
-        <w:tblPrEx>
-          <w:tblCellMar>
-            <w:top w:w="0" w:type="dxa"/>
-            <w:bottom w:w="0" w:type="dxa"/>
-          </w:tblCellMar>
-        </w:tblPrEx>
         <w:tc>
           <w:tcPr>
             <w:tcW w:w="2200" w:type="dxa"/>
@@ -8761,12 +8407,6 @@
         </w:tc>
       </w:tr>
       <w:tr>
-        <w:tblPrEx>
-          <w:tblCellMar>
-            <w:top w:w="0" w:type="dxa"/>
-            <w:bottom w:w="0" w:type="dxa"/>
-          </w:tblCellMar>
-        </w:tblPrEx>
         <w:tc>
           <w:tcPr>
             <w:tcW w:w="2200" w:type="dxa"/>
@@ -8880,12 +8520,6 @@
         </w:tc>
       </w:tr>
       <w:tr>
-        <w:tblPrEx>
-          <w:tblCellMar>
-            <w:top w:w="0" w:type="dxa"/>
-            <w:bottom w:w="0" w:type="dxa"/>
-          </w:tblCellMar>
-        </w:tblPrEx>
         <w:tc>
           <w:tcPr>
             <w:tcW w:w="2200" w:type="dxa"/>
@@ -8995,12 +8629,6 @@
         </w:tc>
       </w:tr>
       <w:tr>
-        <w:tblPrEx>
-          <w:tblCellMar>
-            <w:top w:w="0" w:type="dxa"/>
-            <w:bottom w:w="0" w:type="dxa"/>
-          </w:tblCellMar>
-        </w:tblPrEx>
         <w:tc>
           <w:tcPr>
             <w:tcW w:w="2200" w:type="dxa"/>
@@ -9102,12 +8730,6 @@
         </w:tc>
       </w:tr>
       <w:tr>
-        <w:tblPrEx>
-          <w:tblCellMar>
-            <w:top w:w="0" w:type="dxa"/>
-            <w:bottom w:w="0" w:type="dxa"/>
-          </w:tblCellMar>
-        </w:tblPrEx>
         <w:tc>
           <w:tcPr>
             <w:tcW w:w="2200" w:type="dxa"/>
@@ -9239,12 +8861,6 @@
         </w:tc>
       </w:tr>
       <w:tr>
-        <w:tblPrEx>
-          <w:tblCellMar>
-            <w:top w:w="0" w:type="dxa"/>
-            <w:bottom w:w="0" w:type="dxa"/>
-          </w:tblCellMar>
-        </w:tblPrEx>
         <w:tc>
           <w:tcPr>
             <w:tcW w:w="2200" w:type="dxa"/>
@@ -9364,12 +8980,6 @@
         </w:tc>
       </w:tr>
       <w:tr>
-        <w:tblPrEx>
-          <w:tblCellMar>
-            <w:top w:w="0" w:type="dxa"/>
-            <w:bottom w:w="0" w:type="dxa"/>
-          </w:tblCellMar>
-        </w:tblPrEx>
         <w:tc>
           <w:tcPr>
             <w:tcW w:w="2200" w:type="dxa"/>
@@ -9560,12 +9170,6 @@
         <w:gridCol w:w="4126"/>
       </w:tblGrid>
       <w:tr>
-        <w:tblPrEx>
-          <w:tblCellMar>
-            <w:top w:w="0" w:type="dxa"/>
-            <w:bottom w:w="0" w:type="dxa"/>
-          </w:tblCellMar>
-        </w:tblPrEx>
         <w:trPr>
           <w:tblHeader/>
         </w:trPr>
@@ -9627,12 +9231,6 @@
         </w:tc>
       </w:tr>
       <w:tr>
-        <w:tblPrEx>
-          <w:tblCellMar>
-            <w:top w:w="0" w:type="dxa"/>
-            <w:bottom w:w="0" w:type="dxa"/>
-          </w:tblCellMar>
-        </w:tblPrEx>
         <w:tc>
           <w:tcPr>
             <w:tcW w:w="3500" w:type="dxa"/>
@@ -9703,12 +9301,6 @@
         </w:tc>
       </w:tr>
       <w:tr>
-        <w:tblPrEx>
-          <w:tblCellMar>
-            <w:top w:w="0" w:type="dxa"/>
-            <w:bottom w:w="0" w:type="dxa"/>
-          </w:tblCellMar>
-        </w:tblPrEx>
         <w:tc>
           <w:tcPr>
             <w:tcW w:w="3500" w:type="dxa"/>
@@ -9779,12 +9371,6 @@
         </w:tc>
       </w:tr>
       <w:tr>
-        <w:tblPrEx>
-          <w:tblCellMar>
-            <w:top w:w="0" w:type="dxa"/>
-            <w:bottom w:w="0" w:type="dxa"/>
-          </w:tblCellMar>
-        </w:tblPrEx>
         <w:tc>
           <w:tcPr>
             <w:tcW w:w="3500" w:type="dxa"/>
@@ -9873,12 +9459,6 @@
         </w:tc>
       </w:tr>
       <w:tr>
-        <w:tblPrEx>
-          <w:tblCellMar>
-            <w:top w:w="0" w:type="dxa"/>
-            <w:bottom w:w="0" w:type="dxa"/>
-          </w:tblCellMar>
-        </w:tblPrEx>
         <w:tc>
           <w:tcPr>
             <w:tcW w:w="3500" w:type="dxa"/>
@@ -10323,12 +9903,6 @@
         <w:gridCol w:w="2226"/>
       </w:tblGrid>
       <w:tr>
-        <w:tblPrEx>
-          <w:tblCellMar>
-            <w:top w:w="0" w:type="dxa"/>
-            <w:bottom w:w="0" w:type="dxa"/>
-          </w:tblCellMar>
-        </w:tblPrEx>
         <w:trPr>
           <w:tblHeader/>
         </w:trPr>
@@ -10418,12 +9992,6 @@
         </w:tc>
       </w:tr>
       <w:tr>
-        <w:tblPrEx>
-          <w:tblCellMar>
-            <w:top w:w="0" w:type="dxa"/>
-            <w:bottom w:w="0" w:type="dxa"/>
-          </w:tblCellMar>
-        </w:tblPrEx>
         <w:tc>
           <w:tcPr>
             <w:tcW w:w="2800" w:type="dxa"/>
@@ -10533,12 +10101,6 @@
         </w:tc>
       </w:tr>
       <w:tr>
-        <w:tblPrEx>
-          <w:tblCellMar>
-            <w:top w:w="0" w:type="dxa"/>
-            <w:bottom w:w="0" w:type="dxa"/>
-          </w:tblCellMar>
-        </w:tblPrEx>
         <w:tc>
           <w:tcPr>
             <w:tcW w:w="2800" w:type="dxa"/>
@@ -10640,12 +10202,6 @@
         </w:tc>
       </w:tr>
       <w:tr>
-        <w:tblPrEx>
-          <w:tblCellMar>
-            <w:top w:w="0" w:type="dxa"/>
-            <w:bottom w:w="0" w:type="dxa"/>
-          </w:tblCellMar>
-        </w:tblPrEx>
         <w:tc>
           <w:tcPr>
             <w:tcW w:w="2800" w:type="dxa"/>
@@ -10755,12 +10311,6 @@
         </w:tc>
       </w:tr>
       <w:tr>
-        <w:tblPrEx>
-          <w:tblCellMar>
-            <w:top w:w="0" w:type="dxa"/>
-            <w:bottom w:w="0" w:type="dxa"/>
-          </w:tblCellMar>
-        </w:tblPrEx>
         <w:tc>
           <w:tcPr>
             <w:tcW w:w="2800" w:type="dxa"/>
@@ -10870,12 +10420,6 @@
         </w:tc>
       </w:tr>
       <w:tr>
-        <w:tblPrEx>
-          <w:tblCellMar>
-            <w:top w:w="0" w:type="dxa"/>
-            <w:bottom w:w="0" w:type="dxa"/>
-          </w:tblCellMar>
-        </w:tblPrEx>
         <w:tc>
           <w:tcPr>
             <w:tcW w:w="2800" w:type="dxa"/>
@@ -10991,12 +10535,6 @@
         </w:tc>
       </w:tr>
       <w:tr>
-        <w:tblPrEx>
-          <w:tblCellMar>
-            <w:top w:w="0" w:type="dxa"/>
-            <w:bottom w:w="0" w:type="dxa"/>
-          </w:tblCellMar>
-        </w:tblPrEx>
         <w:tc>
           <w:tcPr>
             <w:tcW w:w="2800" w:type="dxa"/>
@@ -11106,12 +10644,6 @@
         </w:tc>
       </w:tr>
       <w:tr>
-        <w:tblPrEx>
-          <w:tblCellMar>
-            <w:top w:w="0" w:type="dxa"/>
-            <w:bottom w:w="0" w:type="dxa"/>
-          </w:tblCellMar>
-        </w:tblPrEx>
         <w:tc>
           <w:tcPr>
             <w:tcW w:w="2800" w:type="dxa"/>
@@ -11217,13 +10749,178 @@
               <w:t>primary</w:t>
             </w:r>
             <w:proofErr w:type="spellEnd"/>
+          </w:p>
+        </w:tc>
+      </w:tr>
+      <w:tr>
+        <w:tc>
+          <w:tcPr>
+            <w:tcW w:w="2800" w:type="dxa"/>
+            <w:tcBorders>
+              <w:top w:val="single" w:sz="1" w:space="0" w:color="E2E8F0"/>
+              <w:left w:val="single" w:sz="1" w:space="0" w:color="E2E8F0"/>
+              <w:bottom w:val="single" w:sz="1" w:space="0" w:color="E2E8F0"/>
+              <w:right w:val="single" w:sz="1" w:space="0" w:color="E2E8F0"/>
+            </w:tcBorders>
+            <w:tcMar>
+              <w:top w:w="80" w:type="dxa"/>
+              <w:left w:w="120" w:type="dxa"/>
+              <w:bottom w:w="80" w:type="dxa"/>
+              <w:right w:w="120" w:type="dxa"/>
+            </w:tcMar>
+          </w:tcPr>
+          <w:p>
+            <w:pPr>
+              <w:rPr>
+                <w:color w:val="0F172A"/>
+              </w:rPr>
+            </w:pPr>
+          </w:p>
+        </w:tc>
+        <w:tc>
+          <w:tcPr>
+            <w:tcW w:w="2600" w:type="dxa"/>
+            <w:tcBorders>
+              <w:top w:val="single" w:sz="1" w:space="0" w:color="E2E8F0"/>
+              <w:left w:val="single" w:sz="1" w:space="0" w:color="E2E8F0"/>
+              <w:bottom w:val="single" w:sz="1" w:space="0" w:color="E2E8F0"/>
+              <w:right w:val="single" w:sz="1" w:space="0" w:color="E2E8F0"/>
+            </w:tcBorders>
+            <w:tcMar>
+              <w:top w:w="80" w:type="dxa"/>
+              <w:left w:w="120" w:type="dxa"/>
+              <w:bottom w:w="80" w:type="dxa"/>
+              <w:right w:w="120" w:type="dxa"/>
+            </w:tcMar>
+          </w:tcPr>
+          <w:p>
+            <w:pPr>
+              <w:rPr>
+                <w:color w:val="0F172A"/>
+              </w:rPr>
+            </w:pPr>
+          </w:p>
+        </w:tc>
+        <w:tc>
+          <w:tcPr>
+            <w:tcW w:w="2226" w:type="dxa"/>
+            <w:tcBorders>
+              <w:top w:val="single" w:sz="1" w:space="0" w:color="E2E8F0"/>
+              <w:left w:val="single" w:sz="1" w:space="0" w:color="E2E8F0"/>
+              <w:bottom w:val="single" w:sz="1" w:space="0" w:color="E2E8F0"/>
+              <w:right w:val="single" w:sz="1" w:space="0" w:color="E2E8F0"/>
+            </w:tcBorders>
+            <w:tcMar>
+              <w:top w:w="80" w:type="dxa"/>
+              <w:left w:w="120" w:type="dxa"/>
+              <w:bottom w:w="80" w:type="dxa"/>
+              <w:right w:w="120" w:type="dxa"/>
+            </w:tcMar>
+          </w:tcPr>
+          <w:p>
+            <w:pPr>
+              <w:rPr>
+                <w:color w:val="0F172A"/>
+              </w:rPr>
+            </w:pPr>
           </w:p>
         </w:tc>
       </w:tr>
     </w:tbl>
     <w:p>
       <w:pPr>
-        <w:spacing w:before="120"/>
+        <w:pStyle w:val="Balk1"/>
+        <w:pBdr>
+          <w:bottom w:val="single" w:sz="4" w:space="4" w:color="1A56DB"/>
+        </w:pBdr>
+        <w:spacing w:before="400" w:after="160"/>
+        <w:rPr>
+          <w:color w:val="0F172A"/>
+        </w:rPr>
+      </w:pPr>
+      <w:r>
+        <w:t xml:space="preserve">6.5 Sol panel ikon </w:t>
+      </w:r>
+      <w:r>
+        <w:rPr>
+          <w:color w:val="0F172A"/>
+        </w:rPr>
+        <w:t>etiketleri</w:t>
+      </w:r>
+    </w:p>
+    <w:p>
+      <w:pPr>
+        <w:pStyle w:val="ListeParagraf"/>
+        <w:numPr>
+          <w:ilvl w:val="0"/>
+          <w:numId w:val="2"/>
+        </w:numPr>
+        <w:spacing w:before="60" w:after="60"/>
+        <w:rPr>
+          <w:color w:val="0F172A"/>
+        </w:rPr>
+      </w:pPr>
+      <w:r>
+        <w:rPr>
+          <w:color w:val="0F172A"/>
+        </w:rPr>
+        <w:t xml:space="preserve">**Tek kelime kuralı — **Sol paneldeki ikon altı etiketleri tercihen tek kelime olmalı. İki kelime yalnızca tek kelimeyle anlatılamayan istisnai durumlarda kullanılır. </w:t>
+      </w:r>
+    </w:p>
+    <w:p>
+      <w:pPr>
+        <w:pStyle w:val="ListeParagraf"/>
+        <w:numPr>
+          <w:ilvl w:val="0"/>
+          <w:numId w:val="2"/>
+        </w:numPr>
+        <w:spacing w:before="60" w:after="60"/>
+        <w:rPr>
+          <w:color w:val="0F172A"/>
+        </w:rPr>
+      </w:pPr>
+      <w:r>
+        <w:rPr>
+          <w:color w:val="0F172A"/>
+        </w:rPr>
+        <w:t>**Tipografi — **</w:t>
+      </w:r>
+      <w:proofErr w:type="spellStart"/>
+      <w:r>
+        <w:rPr>
+          <w:color w:val="0F172A"/>
+        </w:rPr>
+        <w:t>text-icon-label</w:t>
+      </w:r>
+      <w:proofErr w:type="spellEnd"/>
+      <w:r>
+        <w:rPr>
+          <w:color w:val="0F172A"/>
+        </w:rPr>
+        <w:t xml:space="preserve"> rolü (11px, 500) — Component </w:t>
+      </w:r>
+      <w:proofErr w:type="spellStart"/>
+      <w:r>
+        <w:rPr>
+          <w:color w:val="0F172A"/>
+        </w:rPr>
+        <w:t>Spec</w:t>
+      </w:r>
+      <w:proofErr w:type="spellEnd"/>
+      <w:r>
+        <w:rPr>
+          <w:color w:val="0F172A"/>
+        </w:rPr>
+        <w:t xml:space="preserve"> v3.1 madde 1.1.</w:t>
+      </w:r>
+    </w:p>
+    <w:p>
+      <w:pPr>
+        <w:pStyle w:val="Balk1"/>
+        <w:pBdr>
+          <w:bottom w:val="single" w:sz="4" w:space="4" w:color="1A56DB"/>
+        </w:pBdr>
+        <w:spacing w:before="400" w:after="160"/>
       </w:pPr>
     </w:p>
     <w:p>
@@ -11289,12 +10986,6 @@
         <w:gridCol w:w="3226"/>
       </w:tblGrid>
       <w:tr>
-        <w:tblPrEx>
-          <w:tblCellMar>
-            <w:top w:w="0" w:type="dxa"/>
-            <w:bottom w:w="0" w:type="dxa"/>
-          </w:tblCellMar>
-        </w:tblPrEx>
         <w:trPr>
           <w:tblHeader/>
         </w:trPr>
@@ -11416,12 +11107,6 @@
         </w:tc>
       </w:tr>
       <w:tr>
-        <w:tblPrEx>
-          <w:tblCellMar>
-            <w:top w:w="0" w:type="dxa"/>
-            <w:bottom w:w="0" w:type="dxa"/>
-          </w:tblCellMar>
-        </w:tblPrEx>
         <w:tc>
           <w:tcPr>
             <w:tcW w:w="1800" w:type="dxa"/>
@@ -11542,12 +11227,6 @@
         </w:tc>
       </w:tr>
       <w:tr>
-        <w:tblPrEx>
-          <w:tblCellMar>
-            <w:top w:w="0" w:type="dxa"/>
-            <w:bottom w:w="0" w:type="dxa"/>
-          </w:tblCellMar>
-        </w:tblPrEx>
         <w:tc>
           <w:tcPr>
             <w:tcW w:w="1800" w:type="dxa"/>
@@ -11668,12 +11347,6 @@
         </w:tc>
       </w:tr>
       <w:tr>
-        <w:tblPrEx>
-          <w:tblCellMar>
-            <w:top w:w="0" w:type="dxa"/>
-            <w:bottom w:w="0" w:type="dxa"/>
-          </w:tblCellMar>
-        </w:tblPrEx>
         <w:tc>
           <w:tcPr>
             <w:tcW w:w="1800" w:type="dxa"/>
@@ -11780,12 +11453,6 @@
         </w:tc>
       </w:tr>
       <w:tr>
-        <w:tblPrEx>
-          <w:tblCellMar>
-            <w:top w:w="0" w:type="dxa"/>
-            <w:bottom w:w="0" w:type="dxa"/>
-          </w:tblCellMar>
-        </w:tblPrEx>
         <w:tc>
           <w:tcPr>
             <w:tcW w:w="1800" w:type="dxa"/>
@@ -11898,12 +11565,6 @@
         </w:tc>
       </w:tr>
       <w:tr>
-        <w:tblPrEx>
-          <w:tblCellMar>
-            <w:top w:w="0" w:type="dxa"/>
-            <w:bottom w:w="0" w:type="dxa"/>
-          </w:tblCellMar>
-        </w:tblPrEx>
         <w:tc>
           <w:tcPr>
             <w:tcW w:w="1800" w:type="dxa"/>
@@ -12024,12 +11685,6 @@
         </w:tc>
       </w:tr>
       <w:tr>
-        <w:tblPrEx>
-          <w:tblCellMar>
-            <w:top w:w="0" w:type="dxa"/>
-            <w:bottom w:w="0" w:type="dxa"/>
-          </w:tblCellMar>
-        </w:tblPrEx>
         <w:tc>
           <w:tcPr>
             <w:tcW w:w="1800" w:type="dxa"/>
@@ -12142,12 +11797,6 @@
         </w:tc>
       </w:tr>
       <w:tr>
-        <w:tblPrEx>
-          <w:tblCellMar>
-            <w:top w:w="0" w:type="dxa"/>
-            <w:bottom w:w="0" w:type="dxa"/>
-          </w:tblCellMar>
-        </w:tblPrEx>
         <w:tc>
           <w:tcPr>
             <w:tcW w:w="1800" w:type="dxa"/>
@@ -12260,12 +11909,6 @@
         </w:tc>
       </w:tr>
       <w:tr>
-        <w:tblPrEx>
-          <w:tblCellMar>
-            <w:top w:w="0" w:type="dxa"/>
-            <w:bottom w:w="0" w:type="dxa"/>
-          </w:tblCellMar>
-        </w:tblPrEx>
         <w:tc>
           <w:tcPr>
             <w:tcW w:w="1800" w:type="dxa"/>
@@ -12378,12 +12021,6 @@
         </w:tc>
       </w:tr>
       <w:tr>
-        <w:tblPrEx>
-          <w:tblCellMar>
-            <w:top w:w="0" w:type="dxa"/>
-            <w:bottom w:w="0" w:type="dxa"/>
-          </w:tblCellMar>
-        </w:tblPrEx>
         <w:tc>
           <w:tcPr>
             <w:tcW w:w="1800" w:type="dxa"/>
@@ -12546,12 +12183,6 @@
         <w:gridCol w:w="3126"/>
       </w:tblGrid>
       <w:tr>
-        <w:tblPrEx>
-          <w:tblCellMar>
-            <w:top w:w="0" w:type="dxa"/>
-            <w:bottom w:w="0" w:type="dxa"/>
-          </w:tblCellMar>
-        </w:tblPrEx>
         <w:trPr>
           <w:tblHeader/>
         </w:trPr>
@@ -12613,12 +12244,6 @@
         </w:tc>
       </w:tr>
       <w:tr>
-        <w:tblPrEx>
-          <w:tblCellMar>
-            <w:top w:w="0" w:type="dxa"/>
-            <w:bottom w:w="0" w:type="dxa"/>
-          </w:tblCellMar>
-        </w:tblPrEx>
         <w:tc>
           <w:tcPr>
             <w:tcW w:w="4500" w:type="dxa"/>
@@ -12687,12 +12312,6 @@
         </w:tc>
       </w:tr>
       <w:tr>
-        <w:tblPrEx>
-          <w:tblCellMar>
-            <w:top w:w="0" w:type="dxa"/>
-            <w:bottom w:w="0" w:type="dxa"/>
-          </w:tblCellMar>
-        </w:tblPrEx>
         <w:tc>
           <w:tcPr>
             <w:tcW w:w="4500" w:type="dxa"/>
@@ -12753,12 +12372,6 @@
         </w:tc>
       </w:tr>
       <w:tr>
-        <w:tblPrEx>
-          <w:tblCellMar>
-            <w:top w:w="0" w:type="dxa"/>
-            <w:bottom w:w="0" w:type="dxa"/>
-          </w:tblCellMar>
-        </w:tblPrEx>
         <w:tc>
           <w:tcPr>
             <w:tcW w:w="4500" w:type="dxa"/>
@@ -12819,12 +12432,6 @@
         </w:tc>
       </w:tr>
       <w:tr>
-        <w:tblPrEx>
-          <w:tblCellMar>
-            <w:top w:w="0" w:type="dxa"/>
-            <w:bottom w:w="0" w:type="dxa"/>
-          </w:tblCellMar>
-        </w:tblPrEx>
         <w:tc>
           <w:tcPr>
             <w:tcW w:w="4500" w:type="dxa"/>
@@ -12885,12 +12492,6 @@
         </w:tc>
       </w:tr>
       <w:tr>
-        <w:tblPrEx>
-          <w:tblCellMar>
-            <w:top w:w="0" w:type="dxa"/>
-            <w:bottom w:w="0" w:type="dxa"/>
-          </w:tblCellMar>
-        </w:tblPrEx>
         <w:tc>
           <w:tcPr>
             <w:tcW w:w="4500" w:type="dxa"/>
@@ -12945,12 +12546,6 @@
         </w:tc>
       </w:tr>
       <w:tr>
-        <w:tblPrEx>
-          <w:tblCellMar>
-            <w:top w:w="0" w:type="dxa"/>
-            <w:bottom w:w="0" w:type="dxa"/>
-          </w:tblCellMar>
-        </w:tblPrEx>
         <w:tc>
           <w:tcPr>
             <w:tcW w:w="4500" w:type="dxa"/>
@@ -13039,12 +12634,6 @@
         </w:tc>
       </w:tr>
       <w:tr>
-        <w:tblPrEx>
-          <w:tblCellMar>
-            <w:top w:w="0" w:type="dxa"/>
-            <w:bottom w:w="0" w:type="dxa"/>
-          </w:tblCellMar>
-        </w:tblPrEx>
         <w:tc>
           <w:tcPr>
             <w:tcW w:w="4500" w:type="dxa"/>
@@ -13099,12 +12688,6 @@
         </w:tc>
       </w:tr>
       <w:tr>
-        <w:tblPrEx>
-          <w:tblCellMar>
-            <w:top w:w="0" w:type="dxa"/>
-            <w:bottom w:w="0" w:type="dxa"/>
-          </w:tblCellMar>
-        </w:tblPrEx>
         <w:tc>
           <w:tcPr>
             <w:tcW w:w="4500" w:type="dxa"/>
@@ -13207,12 +12790,6 @@
         <w:gridCol w:w="4995"/>
       </w:tblGrid>
       <w:tr>
-        <w:tblPrEx>
-          <w:tblCellMar>
-            <w:top w:w="0" w:type="dxa"/>
-            <w:bottom w:w="0" w:type="dxa"/>
-          </w:tblCellMar>
-        </w:tblPrEx>
         <w:trPr>
           <w:tblHeader/>
         </w:trPr>
@@ -13274,12 +12851,6 @@
         </w:tc>
       </w:tr>
       <w:tr>
-        <w:tblPrEx>
-          <w:tblCellMar>
-            <w:top w:w="0" w:type="dxa"/>
-            <w:bottom w:w="0" w:type="dxa"/>
-          </w:tblCellMar>
-        </w:tblPrEx>
         <w:tc>
           <w:tcPr>
             <w:tcW w:w="2800" w:type="dxa"/>
@@ -13392,12 +12963,6 @@
         </w:tc>
       </w:tr>
       <w:tr>
-        <w:tblPrEx>
-          <w:tblCellMar>
-            <w:top w:w="0" w:type="dxa"/>
-            <w:bottom w:w="0" w:type="dxa"/>
-          </w:tblCellMar>
-        </w:tblPrEx>
         <w:tc>
           <w:tcPr>
             <w:tcW w:w="2800" w:type="dxa"/>
@@ -13510,12 +13075,6 @@
         </w:tc>
       </w:tr>
       <w:tr>
-        <w:tblPrEx>
-          <w:tblCellMar>
-            <w:top w:w="0" w:type="dxa"/>
-            <w:bottom w:w="0" w:type="dxa"/>
-          </w:tblCellMar>
-        </w:tblPrEx>
         <w:tc>
           <w:tcPr>
             <w:tcW w:w="2800" w:type="dxa"/>
@@ -13628,12 +13187,6 @@
         </w:tc>
       </w:tr>
       <w:tr>
-        <w:tblPrEx>
-          <w:tblCellMar>
-            <w:top w:w="0" w:type="dxa"/>
-            <w:bottom w:w="0" w:type="dxa"/>
-          </w:tblCellMar>
-        </w:tblPrEx>
         <w:tc>
           <w:tcPr>
             <w:tcW w:w="2800" w:type="dxa"/>
@@ -13746,12 +13299,6 @@
         </w:tc>
       </w:tr>
       <w:tr>
-        <w:tblPrEx>
-          <w:tblCellMar>
-            <w:top w:w="0" w:type="dxa"/>
-            <w:bottom w:w="0" w:type="dxa"/>
-          </w:tblCellMar>
-        </w:tblPrEx>
         <w:tc>
           <w:tcPr>
             <w:tcW w:w="2800" w:type="dxa"/>
@@ -13774,7 +13321,6 @@
               <w:rPr>
                 <w:color w:val="0F172A"/>
               </w:rPr>
-              <w:lastRenderedPageBreak/>
               <w:t>SpacingPicker</w:t>
             </w:r>
             <w:proofErr w:type="spellEnd"/>
@@ -13865,12 +13411,6 @@
         </w:tc>
       </w:tr>
       <w:tr>
-        <w:tblPrEx>
-          <w:tblCellMar>
-            <w:top w:w="0" w:type="dxa"/>
-            <w:bottom w:w="0" w:type="dxa"/>
-          </w:tblCellMar>
-        </w:tblPrEx>
         <w:tc>
           <w:tcPr>
             <w:tcW w:w="2800" w:type="dxa"/>
@@ -13983,12 +13523,6 @@
         </w:tc>
       </w:tr>
       <w:tr>
-        <w:tblPrEx>
-          <w:tblCellMar>
-            <w:top w:w="0" w:type="dxa"/>
-            <w:bottom w:w="0" w:type="dxa"/>
-          </w:tblCellMar>
-        </w:tblPrEx>
         <w:tc>
           <w:tcPr>
             <w:tcW w:w="2800" w:type="dxa"/>
@@ -14087,12 +13621,6 @@
         </w:tc>
       </w:tr>
       <w:tr>
-        <w:tblPrEx>
-          <w:tblCellMar>
-            <w:top w:w="0" w:type="dxa"/>
-            <w:bottom w:w="0" w:type="dxa"/>
-          </w:tblCellMar>
-        </w:tblPrEx>
         <w:tc>
           <w:tcPr>
             <w:tcW w:w="2800" w:type="dxa"/>
@@ -14235,12 +13763,6 @@
         </w:tc>
       </w:tr>
       <w:tr>
-        <w:tblPrEx>
-          <w:tblCellMar>
-            <w:top w:w="0" w:type="dxa"/>
-            <w:bottom w:w="0" w:type="dxa"/>
-          </w:tblCellMar>
-        </w:tblPrEx>
         <w:tc>
           <w:tcPr>
             <w:tcW w:w="2800" w:type="dxa"/>
@@ -14355,12 +13877,6 @@
         </w:tc>
       </w:tr>
       <w:tr>
-        <w:tblPrEx>
-          <w:tblCellMar>
-            <w:top w:w="0" w:type="dxa"/>
-            <w:bottom w:w="0" w:type="dxa"/>
-          </w:tblCellMar>
-        </w:tblPrEx>
         <w:tc>
           <w:tcPr>
             <w:tcW w:w="2800" w:type="dxa"/>
@@ -14471,6 +13987,119 @@
 <file path=word/numbering.xml><?xml version="1.0" encoding="utf-8"?>
 <w:numbering xmlns:wpc="http://schemas.microsoft.com/office/word/2010/wordprocessingCanvas" xmlns:cx="http://schemas.microsoft.com/office/drawing/2014/chartex" xmlns:cx1="http://schemas.microsoft.com/office/drawing/2015/9/8/chartex" xmlns:cx2="http://schemas.microsoft.com/office/drawing/2015/10/21/chartex" xmlns:cx3="http://schemas.microsoft.com/office/drawing/2016/5/9/chartex" xmlns:cx4="http://schemas.microsoft.com/office/drawing/2016/5/10/chartex" xmlns:cx5="http://schemas.microsoft.com/office/drawing/2016/5/11/chartex" xmlns:cx6="http://schemas.microsoft.com/office/drawing/2016/5/12/chartex" xmlns:cx7="http://schemas.microsoft.com/office/drawing/2016/5/13/chartex" xmlns:cx8="http://schemas.microsoft.com/office/drawing/2016/5/14/chartex" xmlns:mc="http://schemas.openxmlformats.org/markup-compatibility/2006" xmlns:aink="http://schemas.microsoft.com/office/drawing/2016/ink" xmlns:am3d="http://schemas.microsoft.com/office/drawing/2017/model3d" xmlns:o="urn:schemas-microsoft-com:office:office" xmlns:oel="http://schemas.microsoft.com/office/2019/extlst" xmlns:r="http://schemas.openxmlformats.org/officeDocument/2006/relationships" xmlns:m="http://schemas.openxmlformats.org/officeDocument/2006/math" xmlns:v="urn:schemas-microsoft-com:vml" xmlns:wp14="http://schemas.microsoft.com/office/word/2010/wordprocessingDrawing" xmlns:wp="http://schemas.openxmlformats.org/drawingml/2006/wordprocessingDrawing" xmlns:w10="urn:schemas-microsoft-com:office:word" xmlns:w="http://schemas.openxmlformats.org/wordprocessingml/2006/main" xmlns:w14="http://schemas.microsoft.com/office/word/2010/wordml" xmlns:w15="http://schemas.microsoft.com/office/word/2012/wordml" xmlns:w16cex="http://schemas.microsoft.com/office/word/2018/wordml/cex" xmlns:w16cid="http://schemas.microsoft.com/office/word/2016/wordml/cid" xmlns:w16="http://schemas.microsoft.com/office/word/2018/wordml" xmlns:w16du="http://schemas.microsoft.com/office/word/2023/wordml/word16du" xmlns:w16sdtdh="http://schemas.microsoft.com/office/word/2020/wordml/sdtdatahash" xmlns:w16sdtfl="http://schemas.microsoft.com/office/word/2024/wordml/sdtformatlock" xmlns:w16se="http://schemas.microsoft.com/office/word/2015/wordml/symex" xmlns:wpg="http://schemas.microsoft.com/office/word/2010/wordprocessingGroup" xmlns:wpi="http://schemas.microsoft.com/office/word/2010/wordprocessingInk" xmlns:wne="http://schemas.microsoft.com/office/word/2006/wordml" xmlns:wps="http://schemas.microsoft.com/office/word/2010/wordprocessingShape" mc:Ignorable="w14 w15 w16se w16cid w16 w16cex w16sdtdh w16sdtfl w16du wp14">
   <w:abstractNum w:abstractNumId="0" w15:restartNumberingAfterBreak="0">
+    <w:nsid w:val="1DB84A4E"/>
+    <w:multiLevelType w:val="hybridMultilevel"/>
+    <w:tmpl w:val="9B5CC684"/>
+    <w:lvl w:ilvl="0" w:tplc="041F0001">
+      <w:start w:val="1"/>
+      <w:numFmt w:val="bullet"/>
+      <w:lvlText w:val=""/>
+      <w:lvlJc w:val="left"/>
+      <w:pPr>
+        <w:ind w:left="720" w:hanging="360"/>
+      </w:pPr>
+      <w:rPr>
+        <w:rFonts w:ascii="Symbol" w:hAnsi="Symbol" w:hint="default"/>
+      </w:rPr>
+    </w:lvl>
+    <w:lvl w:ilvl="1" w:tplc="041F0003" w:tentative="1">
+      <w:start w:val="1"/>
+      <w:numFmt w:val="bullet"/>
+      <w:lvlText w:val="o"/>
+      <w:lvlJc w:val="left"/>
+      <w:pPr>
+        <w:ind w:left="1440" w:hanging="360"/>
+      </w:pPr>
+      <w:rPr>
+        <w:rFonts w:ascii="Courier New" w:hAnsi="Courier New" w:cs="Courier New" w:hint="default"/>
+      </w:rPr>
+    </w:lvl>
+    <w:lvl w:ilvl="2" w:tplc="041F0005" w:tentative="1">
+      <w:start w:val="1"/>
+      <w:numFmt w:val="bullet"/>
+      <w:lvlText w:val=""/>
+      <w:lvlJc w:val="left"/>
+      <w:pPr>
+        <w:ind w:left="2160" w:hanging="360"/>
+      </w:pPr>
+      <w:rPr>
+        <w:rFonts w:ascii="Wingdings" w:hAnsi="Wingdings" w:hint="default"/>
+      </w:rPr>
+    </w:lvl>
+    <w:lvl w:ilvl="3" w:tplc="041F0001" w:tentative="1">
+      <w:start w:val="1"/>
+      <w:numFmt w:val="bullet"/>
+      <w:lvlText w:val=""/>
+      <w:lvlJc w:val="left"/>
+      <w:pPr>
+        <w:ind w:left="2880" w:hanging="360"/>
+      </w:pPr>
+      <w:rPr>
+        <w:rFonts w:ascii="Symbol" w:hAnsi="Symbol" w:hint="default"/>
+      </w:rPr>
+    </w:lvl>
+    <w:lvl w:ilvl="4" w:tplc="041F0003" w:tentative="1">
+      <w:start w:val="1"/>
+      <w:numFmt w:val="bullet"/>
+      <w:lvlText w:val="o"/>
+      <w:lvlJc w:val="left"/>
+      <w:pPr>
+        <w:ind w:left="3600" w:hanging="360"/>
+      </w:pPr>
+      <w:rPr>
+        <w:rFonts w:ascii="Courier New" w:hAnsi="Courier New" w:cs="Courier New" w:hint="default"/>
+      </w:rPr>
+    </w:lvl>
+    <w:lvl w:ilvl="5" w:tplc="041F0005" w:tentative="1">
+      <w:start w:val="1"/>
+      <w:numFmt w:val="bullet"/>
+      <w:lvlText w:val=""/>
+      <w:lvlJc w:val="left"/>
+      <w:pPr>
+        <w:ind w:left="4320" w:hanging="360"/>
+      </w:pPr>
+      <w:rPr>
+        <w:rFonts w:ascii="Wingdings" w:hAnsi="Wingdings" w:hint="default"/>
+      </w:rPr>
+    </w:lvl>
+    <w:lvl w:ilvl="6" w:tplc="041F0001" w:tentative="1">
+      <w:start w:val="1"/>
+      <w:numFmt w:val="bullet"/>
+      <w:lvlText w:val=""/>
+      <w:lvlJc w:val="left"/>
+      <w:pPr>
+        <w:ind w:left="5040" w:hanging="360"/>
+      </w:pPr>
+      <w:rPr>
+        <w:rFonts w:ascii="Symbol" w:hAnsi="Symbol" w:hint="default"/>
+      </w:rPr>
+    </w:lvl>
+    <w:lvl w:ilvl="7" w:tplc="041F0003" w:tentative="1">
+      <w:start w:val="1"/>
+      <w:numFmt w:val="bullet"/>
+      <w:lvlText w:val="o"/>
+      <w:lvlJc w:val="left"/>
+      <w:pPr>
+        <w:ind w:left="5760" w:hanging="360"/>
+      </w:pPr>
+      <w:rPr>
+        <w:rFonts w:ascii="Courier New" w:hAnsi="Courier New" w:cs="Courier New" w:hint="default"/>
+      </w:rPr>
+    </w:lvl>
+    <w:lvl w:ilvl="8" w:tplc="041F0005" w:tentative="1">
+      <w:start w:val="1"/>
+      <w:numFmt w:val="bullet"/>
+      <w:lvlText w:val=""/>
+      <w:lvlJc w:val="left"/>
+      <w:pPr>
+        <w:ind w:left="6480" w:hanging="360"/>
+      </w:pPr>
+      <w:rPr>
+        <w:rFonts w:ascii="Wingdings" w:hAnsi="Wingdings" w:hint="default"/>
+      </w:rPr>
+    </w:lvl>
+  </w:abstractNum>
+  <w:abstractNum w:abstractNumId="1" w15:restartNumberingAfterBreak="0">
     <w:nsid w:val="34ED1F0A"/>
     <w:multiLevelType w:val="hybridMultilevel"/>
     <w:tmpl w:val="242E3CA8"/>
@@ -14557,10 +14186,13 @@
     </w:lvl>
   </w:abstractNum>
   <w:num w:numId="1" w16cid:durableId="65998358">
-    <w:abstractNumId w:val="0"/>
+    <w:abstractNumId w:val="1"/>
     <w:lvlOverride w:ilvl="0">
       <w:startOverride w:val="1"/>
     </w:lvlOverride>
+  </w:num>
+  <w:num w:numId="2" w16cid:durableId="242035131">
+    <w:abstractNumId w:val="0"/>
   </w:num>
 </w:numbering>
 </file>
@@ -15046,7 +14678,6 @@
   <w:style w:type="character" w:default="1" w:styleId="VarsaylanParagrafYazTipi">
     <w:name w:val="Default Paragraph Font"/>
     <w:uiPriority w:val="1"/>
-    <w:semiHidden/>
     <w:unhideWhenUsed/>
   </w:style>
   <w:style w:type="table" w:default="1" w:styleId="NormalTablo">

</xml_diff>